<commit_message>
Add admin help guide and update usage manual
</commit_message>
<xml_diff>
--- a/Huong_dan_su_dung.docx
+++ b/Huong_dan_su_dung.docx
@@ -3517,282 +3517,692 @@
     </w:p>
     <w:p>
       <w:pPr>
+        <w:jc w:val="center"/>
         <w:rPr>
           <w:i/>
           <w:color w:val="C0C0C0"/>
         </w:rPr>
       </w:pPr>
       <w:r>
+        <w:drawing>
+          <wp:inline xmlns:a="http://schemas.openxmlformats.org/drawingml/2006/main" xmlns:pic="http://schemas.openxmlformats.org/drawingml/2006/picture">
+            <wp:extent cx="2194560" cy="4749253"/>
+            <wp:docPr id="2050108930" name="Picture 2050108930"/>
+            <wp:cNvGraphicFramePr>
+              <a:graphicFrameLocks noChangeAspect="1"/>
+            </wp:cNvGraphicFramePr>
+            <a:graphic>
+              <a:graphicData uri="http://schemas.openxmlformats.org/drawingml/2006/picture">
+                <pic:pic>
+                  <pic:nvPicPr>
+                    <pic:cNvPr id="0" name="home.png"/>
+                    <pic:cNvPicPr/>
+                  </pic:nvPicPr>
+                  <pic:blipFill>
+                    <a:blip r:embed="rId23"/>
+                    <a:stretch>
+                      <a:fillRect/>
+                    </a:stretch>
+                  </pic:blipFill>
+                  <pic:spPr>
+                    <a:xfrm>
+                      <a:off x="0" y="0"/>
+                      <a:ext cx="2194560" cy="4749253"/>
+                    </a:xfrm>
+                    <a:prstGeom prst="rect"/>
+                  </pic:spPr>
+                </pic:pic>
+              </a:graphicData>
+            </a:graphic>
+          </wp:inline>
+        </w:drawing>
+      </w:r>
+    </w:p>
+    <w:p>
+      <w:pPr>
+        <w:jc w:val="center"/>
+      </w:pPr>
+      <w:r>
+        <w:rPr>
+          <w:i/>
+          <w:color w:val="808080"/>
+          <w:sz w:val="18"/>
+        </w:rPr>
+        <w:t>Trang chủ học viên</w:t>
+      </w:r>
+    </w:p>
+    <w:p>
+      <w:pPr>
+        <w:pStyle w:val="Heading2"/>
+      </w:pPr>
+      <w:bookmarkStart w:id="21" w:name="_Toc238100610"/>
+      <w:r>
+        <w:t>3.2. Lớp đang học</w:t>
+      </w:r>
+      <w:bookmarkEnd w:id="21"/>
+    </w:p>
+    <w:p>
+      <w:r>
+        <w:t>Danh sách các lớp học viên đang tham gia, kèm tên giáo viên, phòng học và lịch học định kỳ trong tuần của từng lớp.</w:t>
+      </w:r>
+    </w:p>
+    <w:p>
+      <w:pPr>
+        <w:jc w:val="center"/>
         <w:rPr>
           <w:i/>
           <w:color w:val="C0C0C0"/>
         </w:rPr>
-        <w:t>[Chua co anh minh hoa: Trang chủ học viên]</w:t>
+      </w:pPr>
+      <w:r>
+        <w:drawing>
+          <wp:inline xmlns:a="http://schemas.openxmlformats.org/drawingml/2006/main" xmlns:pic="http://schemas.openxmlformats.org/drawingml/2006/picture">
+            <wp:extent cx="2194560" cy="4749253"/>
+            <wp:docPr id="2050108931" name="Picture 2050108931"/>
+            <wp:cNvGraphicFramePr>
+              <a:graphicFrameLocks noChangeAspect="1"/>
+            </wp:cNvGraphicFramePr>
+            <a:graphic>
+              <a:graphicData uri="http://schemas.openxmlformats.org/drawingml/2006/picture">
+                <pic:pic>
+                  <pic:nvPicPr>
+                    <pic:cNvPr id="0" name="classes.png"/>
+                    <pic:cNvPicPr/>
+                  </pic:nvPicPr>
+                  <pic:blipFill>
+                    <a:blip r:embed="rId24"/>
+                    <a:stretch>
+                      <a:fillRect/>
+                    </a:stretch>
+                  </pic:blipFill>
+                  <pic:spPr>
+                    <a:xfrm>
+                      <a:off x="0" y="0"/>
+                      <a:ext cx="2194560" cy="4749253"/>
+                    </a:xfrm>
+                    <a:prstGeom prst="rect"/>
+                  </pic:spPr>
+                </pic:pic>
+              </a:graphicData>
+            </a:graphic>
+          </wp:inline>
+        </w:drawing>
+      </w:r>
+    </w:p>
+    <w:p>
+      <w:pPr>
+        <w:jc w:val="center"/>
+      </w:pPr>
+      <w:r>
+        <w:rPr>
+          <w:i/>
+          <w:color w:val="808080"/>
+          <w:sz w:val="18"/>
+        </w:rPr>
+        <w:t>Lớp đang học</w:t>
       </w:r>
     </w:p>
     <w:p>
       <w:pPr>
         <w:pStyle w:val="Heading2"/>
       </w:pPr>
-      <w:bookmarkStart w:id="21" w:name="_Toc238100610"/>
-      <w:r>
-        <w:t>3.2. Lớp đang học</w:t>
-      </w:r>
-      <w:bookmarkEnd w:id="21"/>
-    </w:p>
-    <w:p>
-      <w:r>
-        <w:t>Danh sách các lớp học viên đang tham gia, kèm tên giáo viên, phòng học và lịch học định kỳ trong tuần của từng lớp.</w:t>
-      </w:r>
-    </w:p>
-    <w:p>
-      <w:pPr>
+      <w:bookmarkStart w:id="22" w:name="_Toc238100611"/>
+      <w:r>
+        <w:t>3.3. Lịch học</w:t>
+      </w:r>
+      <w:bookmarkEnd w:id="22"/>
+    </w:p>
+    <w:p>
+      <w:r>
+        <w:t>Xem lịch học cá nhân theo tuần hoặc tháng (tổng hợp từ tất cả các lớp đang học). Nhấn vào một buổi học để xem chi tiết: môn học, giáo viên, giờ học, phòng, trạng thái.</w:t>
+      </w:r>
+    </w:p>
+    <w:p>
+      <w:pPr>
+        <w:jc w:val="center"/>
         <w:rPr>
           <w:i/>
           <w:color w:val="C0C0C0"/>
         </w:rPr>
       </w:pPr>
       <w:r>
+        <w:drawing>
+          <wp:inline xmlns:a="http://schemas.openxmlformats.org/drawingml/2006/main" xmlns:pic="http://schemas.openxmlformats.org/drawingml/2006/picture">
+            <wp:extent cx="2194560" cy="4749253"/>
+            <wp:docPr id="2050108932" name="Picture 2050108932"/>
+            <wp:cNvGraphicFramePr>
+              <a:graphicFrameLocks noChangeAspect="1"/>
+            </wp:cNvGraphicFramePr>
+            <a:graphic>
+              <a:graphicData uri="http://schemas.openxmlformats.org/drawingml/2006/picture">
+                <pic:pic>
+                  <pic:nvPicPr>
+                    <pic:cNvPr id="0" name="schedule.png"/>
+                    <pic:cNvPicPr/>
+                  </pic:nvPicPr>
+                  <pic:blipFill>
+                    <a:blip r:embed="rId25"/>
+                    <a:stretch>
+                      <a:fillRect/>
+                    </a:stretch>
+                  </pic:blipFill>
+                  <pic:spPr>
+                    <a:xfrm>
+                      <a:off x="0" y="0"/>
+                      <a:ext cx="2194560" cy="4749253"/>
+                    </a:xfrm>
+                    <a:prstGeom prst="rect"/>
+                  </pic:spPr>
+                </pic:pic>
+              </a:graphicData>
+            </a:graphic>
+          </wp:inline>
+        </w:drawing>
+      </w:r>
+    </w:p>
+    <w:p>
+      <w:pPr>
+        <w:jc w:val="center"/>
+      </w:pPr>
+      <w:r>
+        <w:rPr>
+          <w:i/>
+          <w:color w:val="808080"/>
+          <w:sz w:val="18"/>
+        </w:rPr>
+        <w:t>Lịch học</w:t>
+      </w:r>
+    </w:p>
+    <w:p>
+      <w:pPr>
+        <w:pStyle w:val="Heading2"/>
+      </w:pPr>
+      <w:bookmarkStart w:id="23" w:name="_Toc238100612"/>
+      <w:r>
+        <w:t>3.4. Điểm danh</w:t>
+      </w:r>
+      <w:bookmarkEnd w:id="23"/>
+    </w:p>
+    <w:p>
+      <w:r>
+        <w:t>Xem lại lịch sử điểm danh cá nhân theo từng tháng, kèm bảng tổng hợp số buổi Có mặt / Vắng / Có phép / Đi trễ.</w:t>
+      </w:r>
+    </w:p>
+    <w:p>
+      <w:pPr>
+        <w:jc w:val="center"/>
         <w:rPr>
           <w:i/>
           <w:color w:val="C0C0C0"/>
         </w:rPr>
-        <w:t>[Chua co anh minh hoa: Lớp đang học]</w:t>
+      </w:pPr>
+      <w:r>
+        <w:drawing>
+          <wp:inline xmlns:a="http://schemas.openxmlformats.org/drawingml/2006/main" xmlns:pic="http://schemas.openxmlformats.org/drawingml/2006/picture">
+            <wp:extent cx="2194560" cy="4749253"/>
+            <wp:docPr id="2050108933" name="Picture 2050108933"/>
+            <wp:cNvGraphicFramePr>
+              <a:graphicFrameLocks noChangeAspect="1"/>
+            </wp:cNvGraphicFramePr>
+            <a:graphic>
+              <a:graphicData uri="http://schemas.openxmlformats.org/drawingml/2006/picture">
+                <pic:pic>
+                  <pic:nvPicPr>
+                    <pic:cNvPr id="0" name="attendance.png"/>
+                    <pic:cNvPicPr/>
+                  </pic:nvPicPr>
+                  <pic:blipFill>
+                    <a:blip r:embed="rId26"/>
+                    <a:stretch>
+                      <a:fillRect/>
+                    </a:stretch>
+                  </pic:blipFill>
+                  <pic:spPr>
+                    <a:xfrm>
+                      <a:off x="0" y="0"/>
+                      <a:ext cx="2194560" cy="4749253"/>
+                    </a:xfrm>
+                    <a:prstGeom prst="rect"/>
+                  </pic:spPr>
+                </pic:pic>
+              </a:graphicData>
+            </a:graphic>
+          </wp:inline>
+        </w:drawing>
+      </w:r>
+    </w:p>
+    <w:p>
+      <w:pPr>
+        <w:jc w:val="center"/>
+      </w:pPr>
+      <w:r>
+        <w:rPr>
+          <w:i/>
+          <w:color w:val="808080"/>
+          <w:sz w:val="18"/>
+        </w:rPr>
+        <w:t>Điểm danh cá nhân</w:t>
       </w:r>
     </w:p>
     <w:p>
       <w:pPr>
         <w:pStyle w:val="Heading2"/>
       </w:pPr>
-      <w:bookmarkStart w:id="22" w:name="_Toc238100611"/>
-      <w:r>
-        <w:t>3.3. Lịch học</w:t>
-      </w:r>
-      <w:bookmarkEnd w:id="22"/>
-    </w:p>
-    <w:p>
-      <w:r>
-        <w:t>Xem lịch học cá nhân theo tuần hoặc tháng (tổng hợp từ tất cả các lớp đang học). Nhấn vào một buổi học để xem chi tiết: môn học, giáo viên, giờ học, phòng, trạng thái.</w:t>
-      </w:r>
-    </w:p>
-    <w:p>
-      <w:pPr>
+      <w:bookmarkStart w:id="24" w:name="_Toc238100613"/>
+      <w:r>
+        <w:t>3.5. Học phí và thanh toán</w:t>
+      </w:r>
+      <w:bookmarkEnd w:id="24"/>
+    </w:p>
+    <w:p>
+      <w:r>
+        <w:t>Xem danh sách các khoản học phí theo tab Chưa đóng / Đã đóng / Tất cả, mỗi khoản hiện rõ số tiền phải đóng, đã đóng, còn lại và hạn đóng.</w:t>
+      </w:r>
+    </w:p>
+    <w:p>
+      <w:pPr>
+        <w:pStyle w:val="ListBullet"/>
+      </w:pPr>
+      <w:r>
+        <w:t>Với khoản còn nợ, nhấn Thanh toán để mở màn hình chuyển khoản: hệ thống hiện mã QR VietQR, thông tin tài khoản ngân hàng của trung tâm, số tiền và nội dung chuyển khoản chính xác (có thể sao chép nhanh).</w:t>
+      </w:r>
+    </w:p>
+    <w:p>
+      <w:pPr>
+        <w:pStyle w:val="ListBullet"/>
+      </w:pPr>
+      <w:r>
+        <w:lastRenderedPageBreak/>
+        <w:t>Sau khi chuyển khoản xong, học viên nhấn Tôi đã chuyển khoản, có thể đính kèm ảnh/PDF biên lai (không bắt buộc), rồi Xác nhận đã chuyển. Giao dịch sẽ ở trạng thái Chờ xác nhận cho đến khi trung tâm đối chiếu và xác nhận (mục 2.9).</w:t>
+      </w:r>
+    </w:p>
+    <w:p>
+      <w:pPr>
+        <w:pStyle w:val="ListBullet"/>
+      </w:pPr>
+      <w:r>
+        <w:t>Mục Lịch sử thanh toán hiện toàn bộ các giao dịch đã thực hiện kèm trạng thái (Chờ xác nhận / Đã xác nhận / Bị từ chối / Đã hủy).</w:t>
+      </w:r>
+    </w:p>
+    <w:p>
+      <w:pPr>
+        <w:jc w:val="center"/>
         <w:rPr>
           <w:i/>
           <w:color w:val="C0C0C0"/>
         </w:rPr>
       </w:pPr>
       <w:r>
+        <w:drawing>
+          <wp:inline xmlns:a="http://schemas.openxmlformats.org/drawingml/2006/main" xmlns:pic="http://schemas.openxmlformats.org/drawingml/2006/picture">
+            <wp:extent cx="2194560" cy="4749253"/>
+            <wp:docPr id="2050108934" name="Picture 2050108934"/>
+            <wp:cNvGraphicFramePr>
+              <a:graphicFrameLocks noChangeAspect="1"/>
+            </wp:cNvGraphicFramePr>
+            <a:graphic>
+              <a:graphicData uri="http://schemas.openxmlformats.org/drawingml/2006/picture">
+                <pic:pic>
+                  <pic:nvPicPr>
+                    <pic:cNvPr id="0" name="fees.png"/>
+                    <pic:cNvPicPr/>
+                  </pic:nvPicPr>
+                  <pic:blipFill>
+                    <a:blip r:embed="rId27"/>
+                    <a:stretch>
+                      <a:fillRect/>
+                    </a:stretch>
+                  </pic:blipFill>
+                  <pic:spPr>
+                    <a:xfrm>
+                      <a:off x="0" y="0"/>
+                      <a:ext cx="2194560" cy="4749253"/>
+                    </a:xfrm>
+                    <a:prstGeom prst="rect"/>
+                  </pic:spPr>
+                </pic:pic>
+              </a:graphicData>
+            </a:graphic>
+          </wp:inline>
+        </w:drawing>
+      </w:r>
+    </w:p>
+    <w:p>
+      <w:pPr>
+        <w:jc w:val="center"/>
+      </w:pPr>
+      <w:r>
+        <w:rPr>
+          <w:i/>
+          <w:color w:val="808080"/>
+          <w:sz w:val="18"/>
+        </w:rPr>
+        <w:t>Học phí học viên</w:t>
+      </w:r>
+    </w:p>
+    <w:p>
+      <w:pPr>
+        <w:jc w:val="center"/>
         <w:rPr>
           <w:i/>
           <w:color w:val="C0C0C0"/>
         </w:rPr>
-        <w:t>[Chua co anh minh hoa: Lịch học]</w:t>
+      </w:pPr>
+      <w:r>
+        <w:drawing>
+          <wp:inline xmlns:a="http://schemas.openxmlformats.org/drawingml/2006/main" xmlns:pic="http://schemas.openxmlformats.org/drawingml/2006/picture">
+            <wp:extent cx="2194560" cy="4749253"/>
+            <wp:docPr id="2050108935" name="Picture 2050108935"/>
+            <wp:cNvGraphicFramePr>
+              <a:graphicFrameLocks noChangeAspect="1"/>
+            </wp:cNvGraphicFramePr>
+            <a:graphic>
+              <a:graphicData uri="http://schemas.openxmlformats.org/drawingml/2006/picture">
+                <pic:pic>
+                  <pic:nvPicPr>
+                    <pic:cNvPr id="0" name="payments.png"/>
+                    <pic:cNvPicPr/>
+                  </pic:nvPicPr>
+                  <pic:blipFill>
+                    <a:blip r:embed="rId28"/>
+                    <a:stretch>
+                      <a:fillRect/>
+                    </a:stretch>
+                  </pic:blipFill>
+                  <pic:spPr>
+                    <a:xfrm>
+                      <a:off x="0" y="0"/>
+                      <a:ext cx="2194560" cy="4749253"/>
+                    </a:xfrm>
+                    <a:prstGeom prst="rect"/>
+                  </pic:spPr>
+                </pic:pic>
+              </a:graphicData>
+            </a:graphic>
+          </wp:inline>
+        </w:drawing>
+      </w:r>
+    </w:p>
+    <w:p>
+      <w:pPr>
+        <w:jc w:val="center"/>
+      </w:pPr>
+      <w:r>
+        <w:rPr>
+          <w:i/>
+          <w:color w:val="808080"/>
+          <w:sz w:val="18"/>
+        </w:rPr>
+        <w:t>Lịch sử thanh toán</w:t>
       </w:r>
     </w:p>
     <w:p>
       <w:pPr>
         <w:pStyle w:val="Heading2"/>
       </w:pPr>
-      <w:bookmarkStart w:id="23" w:name="_Toc238100612"/>
-      <w:r>
-        <w:t>3.4. Điểm danh</w:t>
-      </w:r>
-      <w:bookmarkEnd w:id="23"/>
-    </w:p>
-    <w:p>
-      <w:r>
-        <w:t>Xem lại lịch sử điểm danh cá nhân theo từng tháng, kèm bảng tổng hợp số buổi Có mặt / Vắng / Có phép / Đi trễ.</w:t>
-      </w:r>
-    </w:p>
-    <w:p>
-      <w:pPr>
+      <w:bookmarkStart w:id="25" w:name="_Toc238100614"/>
+      <w:r>
+        <w:t>3.6. Tài liệu</w:t>
+      </w:r>
+      <w:bookmarkEnd w:id="25"/>
+    </w:p>
+    <w:p>
+      <w:r>
+        <w:t>Xem và tải về các tài liệu được trung tâm/giáo viên chia sẻ cho lớp của mình hoặc cho toàn trung tâm. Có thể tìm theo tên hoặc lọc theo lớp.</w:t>
+      </w:r>
+    </w:p>
+    <w:p>
+      <w:pPr>
+        <w:jc w:val="center"/>
         <w:rPr>
           <w:i/>
           <w:color w:val="C0C0C0"/>
         </w:rPr>
       </w:pPr>
       <w:r>
+        <w:drawing>
+          <wp:inline xmlns:a="http://schemas.openxmlformats.org/drawingml/2006/main" xmlns:pic="http://schemas.openxmlformats.org/drawingml/2006/picture">
+            <wp:extent cx="2194560" cy="4749253"/>
+            <wp:docPr id="2050108936" name="Picture 2050108936"/>
+            <wp:cNvGraphicFramePr>
+              <a:graphicFrameLocks noChangeAspect="1"/>
+            </wp:cNvGraphicFramePr>
+            <a:graphic>
+              <a:graphicData uri="http://schemas.openxmlformats.org/drawingml/2006/picture">
+                <pic:pic>
+                  <pic:nvPicPr>
+                    <pic:cNvPr id="0" name="documents.png"/>
+                    <pic:cNvPicPr/>
+                  </pic:nvPicPr>
+                  <pic:blipFill>
+                    <a:blip r:embed="rId29"/>
+                    <a:stretch>
+                      <a:fillRect/>
+                    </a:stretch>
+                  </pic:blipFill>
+                  <pic:spPr>
+                    <a:xfrm>
+                      <a:off x="0" y="0"/>
+                      <a:ext cx="2194560" cy="4749253"/>
+                    </a:xfrm>
+                    <a:prstGeom prst="rect"/>
+                  </pic:spPr>
+                </pic:pic>
+              </a:graphicData>
+            </a:graphic>
+          </wp:inline>
+        </w:drawing>
+      </w:r>
+    </w:p>
+    <w:p>
+      <w:pPr>
+        <w:jc w:val="center"/>
+      </w:pPr>
+      <w:r>
+        <w:rPr>
+          <w:i/>
+          <w:color w:val="808080"/>
+          <w:sz w:val="18"/>
+        </w:rPr>
+        <w:t>Tài liệu</w:t>
+      </w:r>
+    </w:p>
+    <w:p>
+      <w:pPr>
+        <w:pStyle w:val="Heading2"/>
+      </w:pPr>
+      <w:bookmarkStart w:id="26" w:name="_Toc238100615"/>
+      <w:r>
+        <w:t>3.7. Thông báo</w:t>
+      </w:r>
+      <w:bookmarkEnd w:id="26"/>
+    </w:p>
+    <w:p>
+      <w:r>
+        <w:t>Xem các thông báo từ trung tâm (thông báo chung, thông báo riêng cho lớp, thông báo học phí mới...). Nhấn vào một thông báo để đánh dấu đã đọc, hoặc dùng nút Đánh dấu đã đọc để đánh dấu tất cả cùng lúc.</w:t>
+      </w:r>
+    </w:p>
+    <w:p>
+      <w:pPr>
+        <w:jc w:val="center"/>
         <w:rPr>
           <w:i/>
           <w:color w:val="C0C0C0"/>
         </w:rPr>
-        <w:t>[Chua co anh minh hoa: Điểm danh cá nhân]</w:t>
+      </w:pPr>
+      <w:r>
+        <w:drawing>
+          <wp:inline xmlns:a="http://schemas.openxmlformats.org/drawingml/2006/main" xmlns:pic="http://schemas.openxmlformats.org/drawingml/2006/picture">
+            <wp:extent cx="2194560" cy="4749253"/>
+            <wp:docPr id="2050108937" name="Picture 2050108937"/>
+            <wp:cNvGraphicFramePr>
+              <a:graphicFrameLocks noChangeAspect="1"/>
+            </wp:cNvGraphicFramePr>
+            <a:graphic>
+              <a:graphicData uri="http://schemas.openxmlformats.org/drawingml/2006/picture">
+                <pic:pic>
+                  <pic:nvPicPr>
+                    <pic:cNvPr id="0" name="notifications.png"/>
+                    <pic:cNvPicPr/>
+                  </pic:nvPicPr>
+                  <pic:blipFill>
+                    <a:blip r:embed="rId30"/>
+                    <a:stretch>
+                      <a:fillRect/>
+                    </a:stretch>
+                  </pic:blipFill>
+                  <pic:spPr>
+                    <a:xfrm>
+                      <a:off x="0" y="0"/>
+                      <a:ext cx="2194560" cy="4749253"/>
+                    </a:xfrm>
+                    <a:prstGeom prst="rect"/>
+                  </pic:spPr>
+                </pic:pic>
+              </a:graphicData>
+            </a:graphic>
+          </wp:inline>
+        </w:drawing>
+      </w:r>
+    </w:p>
+    <w:p>
+      <w:pPr>
+        <w:jc w:val="center"/>
+      </w:pPr>
+      <w:r>
+        <w:rPr>
+          <w:i/>
+          <w:color w:val="808080"/>
+          <w:sz w:val="18"/>
+        </w:rPr>
+        <w:t>Thông báo</w:t>
       </w:r>
     </w:p>
     <w:p>
       <w:pPr>
         <w:pStyle w:val="Heading2"/>
       </w:pPr>
-      <w:bookmarkStart w:id="24" w:name="_Toc238100613"/>
-      <w:r>
-        <w:t>3.5. Học phí và thanh toán</w:t>
-      </w:r>
-      <w:bookmarkEnd w:id="24"/>
-    </w:p>
-    <w:p>
-      <w:r>
-        <w:t>Xem danh sách các khoản học phí theo tab Chưa đóng / Đã đóng / Tất cả, mỗi khoản hiện rõ số tiền phải đóng, đã đóng, còn lại và hạn đóng.</w:t>
-      </w:r>
-    </w:p>
-    <w:p>
-      <w:pPr>
-        <w:pStyle w:val="ListBullet"/>
-      </w:pPr>
-      <w:r>
-        <w:t>Với khoản còn nợ, nhấn Thanh toán để mở màn hình chuyển khoản: hệ thống hiện mã QR VietQR, thông tin tài khoản ngân hàng của trung tâm, số tiền và nội dung chuyển khoản chính xác (có thể sao chép nhanh).</w:t>
-      </w:r>
-    </w:p>
-    <w:p>
-      <w:pPr>
-        <w:pStyle w:val="ListBullet"/>
-      </w:pPr>
-      <w:r>
-        <w:lastRenderedPageBreak/>
-        <w:t>Sau khi chuyển khoản xong, học viên nhấn Tôi đã chuyển khoản, có thể đính kèm ảnh/PDF biên lai (không bắt buộc), rồi Xác nhận đã chuyển. Giao dịch sẽ ở trạng thái Chờ xác nhận cho đến khi trung tâm đối chiếu và xác nhận (mục 2.9).</w:t>
-      </w:r>
-    </w:p>
-    <w:p>
-      <w:pPr>
-        <w:pStyle w:val="ListBullet"/>
-      </w:pPr>
-      <w:r>
-        <w:t>Mục Lịch sử thanh toán hiện toàn bộ các giao dịch đã thực hiện kèm trạng thái (Chờ xác nhận / Đã xác nhận / Bị từ chối / Đã hủy).</w:t>
-      </w:r>
-    </w:p>
-    <w:p>
-      <w:pPr>
+      <w:bookmarkStart w:id="27" w:name="_Toc238100616"/>
+      <w:r>
+        <w:t>3.8. Hồ sơ cá nhân và Đổi mật khẩu</w:t>
+      </w:r>
+      <w:bookmarkEnd w:id="27"/>
+    </w:p>
+    <w:p>
+      <w:r>
+        <w:t>Vào mục Thêm &gt; Hồ sơ cá nhân để xem thông tin cá nhân và thông tin phụ huynh (để cập nhật, liên hệ trực tiếp trung tâm). Mục Thêm cũng chứa lối tắt đến Đổi mật khẩu và nút Đăng xuất.</w:t>
+      </w:r>
+    </w:p>
+    <w:p>
+      <w:pPr>
+        <w:jc w:val="center"/>
         <w:rPr>
           <w:i/>
           <w:color w:val="C0C0C0"/>
         </w:rPr>
       </w:pPr>
       <w:r>
+        <w:drawing>
+          <wp:inline xmlns:a="http://schemas.openxmlformats.org/drawingml/2006/main" xmlns:pic="http://schemas.openxmlformats.org/drawingml/2006/picture">
+            <wp:extent cx="2194560" cy="4749253"/>
+            <wp:docPr id="2050108938" name="Picture 2050108938"/>
+            <wp:cNvGraphicFramePr>
+              <a:graphicFrameLocks noChangeAspect="1"/>
+            </wp:cNvGraphicFramePr>
+            <a:graphic>
+              <a:graphicData uri="http://schemas.openxmlformats.org/drawingml/2006/picture">
+                <pic:pic>
+                  <pic:nvPicPr>
+                    <pic:cNvPr id="0" name="profile.png"/>
+                    <pic:cNvPicPr/>
+                  </pic:nvPicPr>
+                  <pic:blipFill>
+                    <a:blip r:embed="rId31"/>
+                    <a:stretch>
+                      <a:fillRect/>
+                    </a:stretch>
+                  </pic:blipFill>
+                  <pic:spPr>
+                    <a:xfrm>
+                      <a:off x="0" y="0"/>
+                      <a:ext cx="2194560" cy="4749253"/>
+                    </a:xfrm>
+                    <a:prstGeom prst="rect"/>
+                  </pic:spPr>
+                </pic:pic>
+              </a:graphicData>
+            </a:graphic>
+          </wp:inline>
+        </w:drawing>
+      </w:r>
+    </w:p>
+    <w:p>
+      <w:pPr>
+        <w:jc w:val="center"/>
+      </w:pPr>
+      <w:r>
+        <w:rPr>
+          <w:i/>
+          <w:color w:val="808080"/>
+          <w:sz w:val="18"/>
+        </w:rPr>
+        <w:t>Hồ sơ cá nhân</w:t>
+      </w:r>
+    </w:p>
+    <w:p>
+      <w:pPr>
+        <w:jc w:val="center"/>
         <w:rPr>
           <w:i/>
           <w:color w:val="C0C0C0"/>
         </w:rPr>
-        <w:t>[Chua co anh minh hoa: Học phí học viên]</w:t>
-      </w:r>
-    </w:p>
-    <w:p>
-      <w:pPr>
+      </w:pPr>
+      <w:r>
+        <w:drawing>
+          <wp:inline xmlns:a="http://schemas.openxmlformats.org/drawingml/2006/main" xmlns:pic="http://schemas.openxmlformats.org/drawingml/2006/picture">
+            <wp:extent cx="2194560" cy="4749253"/>
+            <wp:docPr id="2050108939" name="Picture 2050108939"/>
+            <wp:cNvGraphicFramePr>
+              <a:graphicFrameLocks noChangeAspect="1"/>
+            </wp:cNvGraphicFramePr>
+            <a:graphic>
+              <a:graphicData uri="http://schemas.openxmlformats.org/drawingml/2006/picture">
+                <pic:pic>
+                  <pic:nvPicPr>
+                    <pic:cNvPr id="0" name="more.png"/>
+                    <pic:cNvPicPr/>
+                  </pic:nvPicPr>
+                  <pic:blipFill>
+                    <a:blip r:embed="rId32"/>
+                    <a:stretch>
+                      <a:fillRect/>
+                    </a:stretch>
+                  </pic:blipFill>
+                  <pic:spPr>
+                    <a:xfrm>
+                      <a:off x="0" y="0"/>
+                      <a:ext cx="2194560" cy="4749253"/>
+                    </a:xfrm>
+                    <a:prstGeom prst="rect"/>
+                  </pic:spPr>
+                </pic:pic>
+              </a:graphicData>
+            </a:graphic>
+          </wp:inline>
+        </w:drawing>
+      </w:r>
+    </w:p>
+    <w:p>
+      <w:pPr>
+        <w:jc w:val="center"/>
+      </w:pPr>
+      <w:r>
         <w:rPr>
           <w:i/>
-          <w:color w:val="C0C0C0"/>
-        </w:rPr>
-      </w:pPr>
-      <w:r>
-        <w:rPr>
-          <w:i/>
-          <w:color w:val="C0C0C0"/>
-        </w:rPr>
-        <w:t>[Chua co anh minh hoa: Lịch sử thanh toán]</w:t>
-      </w:r>
-    </w:p>
-    <w:p>
-      <w:pPr>
-        <w:pStyle w:val="Heading2"/>
-      </w:pPr>
-      <w:bookmarkStart w:id="25" w:name="_Toc238100614"/>
-      <w:r>
-        <w:t>3.6. Tài liệu</w:t>
-      </w:r>
-      <w:bookmarkEnd w:id="25"/>
-    </w:p>
-    <w:p>
-      <w:r>
-        <w:t>Xem và tải về các tài liệu được trung tâm/giáo viên chia sẻ cho lớp của mình hoặc cho toàn trung tâm. Có thể tìm theo tên hoặc lọc theo lớp.</w:t>
-      </w:r>
-    </w:p>
-    <w:p>
-      <w:pPr>
-        <w:rPr>
-          <w:i/>
-          <w:color w:val="C0C0C0"/>
-        </w:rPr>
-      </w:pPr>
-      <w:r>
-        <w:rPr>
-          <w:i/>
-          <w:color w:val="C0C0C0"/>
-        </w:rPr>
-        <w:t>[Chua co anh minh hoa: Tài liệu]</w:t>
-      </w:r>
-    </w:p>
-    <w:p>
-      <w:pPr>
-        <w:pStyle w:val="Heading2"/>
-      </w:pPr>
-      <w:bookmarkStart w:id="26" w:name="_Toc238100615"/>
-      <w:r>
-        <w:t>3.7. Thông báo</w:t>
-      </w:r>
-      <w:bookmarkEnd w:id="26"/>
-    </w:p>
-    <w:p>
-      <w:r>
-        <w:t>Xem các thông báo từ trung tâm (thông báo chung, thông báo riêng cho lớp, thông báo học phí mới...). Nhấn vào một thông báo để đánh dấu đã đọc, hoặc dùng nút Đánh dấu đã đọc để đánh dấu tất cả cùng lúc.</w:t>
-      </w:r>
-    </w:p>
-    <w:p>
-      <w:pPr>
-        <w:rPr>
-          <w:i/>
-          <w:color w:val="C0C0C0"/>
-        </w:rPr>
-      </w:pPr>
-      <w:r>
-        <w:rPr>
-          <w:i/>
-          <w:color w:val="C0C0C0"/>
-        </w:rPr>
-        <w:t>[Chua co anh minh hoa: Thông báo]</w:t>
-      </w:r>
-    </w:p>
-    <w:p>
-      <w:pPr>
-        <w:pStyle w:val="Heading2"/>
-      </w:pPr>
-      <w:bookmarkStart w:id="27" w:name="_Toc238100616"/>
-      <w:r>
-        <w:t>3.8. Hồ sơ cá nhân và Đổi mật khẩu</w:t>
-      </w:r>
-      <w:bookmarkEnd w:id="27"/>
-    </w:p>
-    <w:p>
-      <w:r>
-        <w:t>Vào mục Thêm &gt; Hồ sơ cá nhân để xem thông tin cá nhân và thông tin phụ huynh (để cập nhật, liên hệ trực tiếp trung tâm). Mục Thêm cũng chứa lối tắt đến Đổi mật khẩu và nút Đăng xuất.</w:t>
-      </w:r>
-    </w:p>
-    <w:p>
-      <w:pPr>
-        <w:rPr>
-          <w:i/>
-          <w:color w:val="C0C0C0"/>
-        </w:rPr>
-      </w:pPr>
-      <w:r>
-        <w:rPr>
-          <w:i/>
-          <w:color w:val="C0C0C0"/>
-        </w:rPr>
-        <w:t>[Chua co anh minh hoa: Hồ sơ cá nhân]</w:t>
-      </w:r>
-    </w:p>
-    <w:p>
-      <w:pPr>
-        <w:rPr>
-          <w:i/>
-          <w:color w:val="C0C0C0"/>
-        </w:rPr>
-      </w:pPr>
-      <w:r>
-        <w:rPr>
-          <w:i/>
-          <w:color w:val="C0C0C0"/>
-        </w:rPr>
-        <w:t>[Chua co anh minh hoa: Mục Thêm]</w:t>
+          <w:color w:val="808080"/>
+          <w:sz w:val="18"/>
+        </w:rPr>
+        <w:t>Mục Thêm</w:t>
       </w:r>
     </w:p>
     <w:p>

</xml_diff>